<commit_message>
Adiciona link do GitHub e PDF final da atividade
Co-Authored-By: Claude Opus 5.5 <noreply@anthropic.com>
</commit_message>
<xml_diff>
--- a/docs/Atividade Pratica - Gabriel Costa - RU 5484519.docx
+++ b/docs/Atividade Pratica - Gabriel Costa - RU 5484519.docx
@@ -4070,9 +4070,8 @@
       <w:r>
         <w:rPr>
           <w:rFonts w:ascii="Arial" w:hAnsi="Arial" w:cs="Arial"/>
-          <w:highlight w:val="yellow"/>
-        </w:rPr>
-        <w:t xml:space="preserve">https://github.com/SEU-USUARIO/baozi-store</w:t>
+        </w:rPr>
+        <w:t xml:space="preserve">https://github.com/Gbcavalieri/baozi-store</w:t>
       </w:r>
     </w:p>
     <w:sectPr>

</xml_diff>